<commit_message>
docs: finalize Building Simulation submission package (double-blind)
Split into Springer double-blind format:
- blinded_manuscript: no author info, GitHub URL anonymized
- title_page: cover letter + author + declarations + acknowledgements
- Removed duplicate Elsevier-style declarations (CRediT, AI disclosure)
- Fixed funding to KETEP (RS-00238487), not Sangmyung Fund
- Fixed competing interest: explicit patent disclosure per Springer format
- Fixed data availability: checkpoints "upon request" matching README
- Fixed cover letter: singular author ("The author has approved")

All Unicode symbols verified clean (±, –, —, ×, −, λ at correct codepoints).

Co-Authored-By: Claude Opus 4.6 <noreply@anthropic.com>
</commit_message>
<xml_diff>
--- a/docs/paper_final.docx
+++ b/docs/paper_final.docx
@@ -28,7 +28,7 @@
         </w:p>
       </w:sdtContent>
     </w:sdt>
-    <w:bookmarkStart w:id="50" w:name="Xb5a71e468445f1486cddda9b1378d41057800b4"/>
+    <w:bookmarkStart w:id="45" w:name="Xb5a71e468445f1486cddda9b1378d41057800b4"/>
     <w:p>
       <w:pPr>
         <w:pStyle w:val="Heading1"/>
@@ -124,13 +124,6 @@
       </w:r>
       <w:r>
         <w:t xml:space="preserve">: operational diversity, zero-shot forecasting, building energy, foundation models, data-centric AI, Latin Hypercube Sampling, pattern coverage</w:t>
-      </w:r>
-    </w:p>
-    <w:p>
-      <w:r>
-        <w:pict>
-          <v:rect style="width:0;height:1.5pt" o:hralign="center" o:hrstd="t" o:hr="t"/>
-        </w:pict>
       </w:r>
     </w:p>
     <w:p>
@@ -3951,7 +3944,7 @@
       </w:r>
     </w:p>
     <w:bookmarkEnd w:id="34"/>
-    <w:bookmarkStart w:id="35" w:name="acknowledgements"/>
+    <w:bookmarkStart w:id="35" w:name="references"/>
     <w:p>
       <w:pPr>
         <w:pStyle w:val="Heading2"/>
@@ -3966,7 +3959,7 @@
         <w:tab/>
       </w:r>
       <w:r>
-        <w:t xml:space="preserve">Acknowledgements</w:t>
+        <w:t xml:space="preserve">References</w:t>
       </w:r>
     </w:p>
     <w:p>
@@ -3974,11 +3967,245 @@
         <w:pStyle w:val="FirstParagraph"/>
       </w:pPr>
       <w:r>
-        <w:t xml:space="preserve">This work was supported by the Korea Institute of Energy Technology Evaluation and Planning (KETEP) grant funded by the Ministry of Trade, Industry and Energy, Republic of Korea (Grant No. RS-00238487).</w:t>
+        <w:t xml:space="preserve">[1] Fan C, et al. A short-term building cooling load prediction method using deep learning algorithms. Appl Energy 2017;195:222–33.</w:t>
+      </w:r>
+    </w:p>
+    <w:p>
+      <w:pPr>
+        <w:pStyle w:val="BodyText"/>
+      </w:pPr>
+      <w:r>
+        <w:t xml:space="preserve">[2] Hong T, et al. Ten questions on urban building energy modeling. Build Environ 2019;168:106508.</w:t>
+      </w:r>
+    </w:p>
+    <w:p>
+      <w:pPr>
+        <w:pStyle w:val="BodyText"/>
+      </w:pPr>
+      <w:r>
+        <w:t xml:space="preserve">[3] Emami P, Sahu A, Graf P. BuildingsBench: A Large-Scale Dataset of 900K Buildings and Benchmark for Short-Term Load Forecasting. Adv Neural Inf Process Syst 2023;36.</w:t>
+      </w:r>
+    </w:p>
+    <w:p>
+      <w:pPr>
+        <w:pStyle w:val="BodyText"/>
+      </w:pPr>
+      <w:r>
+        <w:t xml:space="preserve">[4] Wilson E, et al. End-Use Load Profiles for the U.S. Building Stock. Golden (CO): National Renewable Energy Laboratory; 2022. Report No.: NREL/TP-5500-80889.</w:t>
+      </w:r>
+    </w:p>
+    <w:p>
+      <w:pPr>
+        <w:pStyle w:val="BodyText"/>
+      </w:pPr>
+      <w:r>
+        <w:t xml:space="preserve">[5] Shi J, et al. Scaling Law for Time Series Forecasting. Adv Neural Inf Process Syst 2024;37.</w:t>
+      </w:r>
+    </w:p>
+    <w:p>
+      <w:pPr>
+        <w:pStyle w:val="BodyText"/>
+      </w:pPr>
+      <w:r>
+        <w:t xml:space="preserve">[6] Liu X, et al. MOIRAI-MoE: Empowering Time Series Foundation Models with Sparse Mixture of Experts. Proc Mach Learn Res 2025;267:38940–62.</w:t>
+      </w:r>
+    </w:p>
+    <w:p>
+      <w:pPr>
+        <w:pStyle w:val="BodyText"/>
+      </w:pPr>
+      <w:r>
+        <w:t xml:space="preserve">[7] Zha D, et al. Data-centric AI: Perspectives and Challenges. Proc SIAM Int Conf Data Min; 2023. p. 945–8.</w:t>
+      </w:r>
+    </w:p>
+    <w:p>
+      <w:pPr>
+        <w:pStyle w:val="BodyText"/>
+      </w:pPr>
+      <w:r>
+        <w:t xml:space="preserve">[8] Kim T, et al. Reversible Instance Normalization for Accurate Time-Series Forecasting against Distribution Shift. Int Conf Learn Represent; 2022.</w:t>
+      </w:r>
+    </w:p>
+    <w:p>
+      <w:pPr>
+        <w:pStyle w:val="BodyText"/>
+      </w:pPr>
+      <w:r>
+        <w:t xml:space="preserve">[9] Amasyali K, El-Gohary NM. A review of data-driven building energy consumption prediction studies. Renew Sustain Energy Rev 2018;81:1192–205.</w:t>
+      </w:r>
+    </w:p>
+    <w:p>
+      <w:pPr>
+        <w:pStyle w:val="BodyText"/>
+      </w:pPr>
+      <w:r>
+        <w:t xml:space="preserve">[10] Chen T, Guestrin C. XGBoost: A Scalable Tree Boosting System. Proc 22nd ACM SIGKDD Int Conf Knowl Discov Data Min; 2016. p. 785–94.</w:t>
+      </w:r>
+    </w:p>
+    <w:p>
+      <w:pPr>
+        <w:pStyle w:val="BodyText"/>
+      </w:pPr>
+      <w:r>
+        <w:t xml:space="preserve">[11] Hochreiter S, Schmidhuber J. Long Short-Term Memory. Neural Comput 1997;9(8):1735–80.</w:t>
+      </w:r>
+    </w:p>
+    <w:p>
+      <w:pPr>
+        <w:pStyle w:val="BodyText"/>
+      </w:pPr>
+      <w:r>
+        <w:t xml:space="preserve">[12] Vaswani A, et al. Attention Is All You Need. Adv Neural Inf Process Syst 2017;30.</w:t>
+      </w:r>
+    </w:p>
+    <w:p>
+      <w:pPr>
+        <w:pStyle w:val="BodyText"/>
+      </w:pPr>
+      <w:r>
+        <w:t xml:space="preserve">[13] Nie Y, et al. A Time Series is Worth 64 Words: Long-term Forecasting with Transformers. Int Conf Learn Represent; 2023.</w:t>
+      </w:r>
+    </w:p>
+    <w:p>
+      <w:pPr>
+        <w:pStyle w:val="BodyText"/>
+      </w:pPr>
+      <w:r>
+        <w:t xml:space="preserve">[14] Ribeiro M, et al. Transfer learning with seasonal and trend adjustment for cross-building energy forecasting. Energy Build 2018;165:352–63.</w:t>
+      </w:r>
+    </w:p>
+    <w:p>
+      <w:pPr>
+        <w:pStyle w:val="BodyText"/>
+      </w:pPr>
+      <w:r>
+        <w:t xml:space="preserve">[15] Spencer R, et al. Transfer Learning on Transformers for Building Energy Consumption Forecasting — A Comparative Study. Energy Build 2025;336:115632.</w:t>
+      </w:r>
+    </w:p>
+    <w:p>
+      <w:pPr>
+        <w:pStyle w:val="BodyText"/>
+      </w:pPr>
+      <w:r>
+        <w:t xml:space="preserve">[16] Das A, et al. A decoder-only foundation model for time-series forecasting. Proc Mach Learn Res 2024;235:10148–67.</w:t>
+      </w:r>
+    </w:p>
+    <w:p>
+      <w:pPr>
+        <w:pStyle w:val="BodyText"/>
+      </w:pPr>
+      <w:r>
+        <w:t xml:space="preserve">[17] Ansari AF, et al. Chronos: Learning the Language of Time Series. Trans Mach Learn Res 2024.</w:t>
+      </w:r>
+    </w:p>
+    <w:p>
+      <w:pPr>
+        <w:pStyle w:val="BodyText"/>
+      </w:pPr>
+      <w:r>
+        <w:t xml:space="preserve">[18] Rasul K, et al. Lag-Llama: Towards Foundation Models for Probabilistic Time Series Forecasting. NeurIPS Workshop Robustness Found Models; 2023.</w:t>
+      </w:r>
+    </w:p>
+    <w:p>
+      <w:pPr>
+        <w:pStyle w:val="BodyText"/>
+      </w:pPr>
+      <w:r>
+        <w:t xml:space="preserve">[19] Woo G, et al. Unified Training of Universal Time Series Forecasting Transformers. Proc Mach Learn Res 2024;235:53140–64.</w:t>
+      </w:r>
+    </w:p>
+    <w:p>
+      <w:pPr>
+        <w:pStyle w:val="BodyText"/>
+      </w:pPr>
+      <w:r>
+        <w:t xml:space="preserve">[20] Yao Q, et al. Towards Neural Scaling Laws for Time Series Foundation Models. Int Conf Learn Represent; 2025.</w:t>
+      </w:r>
+    </w:p>
+    <w:p>
+      <w:pPr>
+        <w:pStyle w:val="BodyText"/>
+      </w:pPr>
+      <w:r>
+        <w:t xml:space="preserve">[21] Crawley DB, et al. EnergyPlus: creating a new-generation building energy simulation program. Energy Build 2001;33(4):319–31.</w:t>
+      </w:r>
+    </w:p>
+    <w:p>
+      <w:pPr>
+        <w:pStyle w:val="BodyText"/>
+      </w:pPr>
+      <w:r>
+        <w:t xml:space="preserve">[22] Deru M, et al. U.S. Department of Energy Commercial Reference Building Models of the National Building Stock. Golden (CO): National Renewable Energy Laboratory; 2011. Report No.: NREL/TP-5500-46861.</w:t>
+      </w:r>
+    </w:p>
+    <w:p>
+      <w:pPr>
+        <w:pStyle w:val="BodyText"/>
+      </w:pPr>
+      <w:r>
+        <w:t xml:space="preserve">[23] McKay MD, Beckman RJ, Conover WJ. A Comparison of Three Methods for Selecting Values of Input Variables in the Analysis of Output from a Computer Code. Technometrics 1979;21(2):239–45.</w:t>
+      </w:r>
+    </w:p>
+    <w:p>
+      <w:pPr>
+        <w:pStyle w:val="BodyText"/>
+      </w:pPr>
+      <w:r>
+        <w:t xml:space="preserve">[24] Box GEP, Cox DR. An Analysis of Transformations. J R Stat Soc B 1964;26(2):211–52.</w:t>
+      </w:r>
+    </w:p>
+    <w:p>
+      <w:pPr>
+        <w:pStyle w:val="BodyText"/>
+      </w:pPr>
+      <w:r>
+        <w:t xml:space="preserve">[25] Loshchilov I, Hutter F. Decoupled Weight Decay Regularization. Int Conf Learn Represent; 2019.</w:t>
+      </w:r>
+    </w:p>
+    <w:p>
+      <w:pPr>
+        <w:pStyle w:val="BodyText"/>
+      </w:pPr>
+      <w:r>
+        <w:t xml:space="preserve">[26] Miller C, et al. The Building Data Genome Project 2, energy meter data from the ASHRAE Great Energy Predictor III competition. Sci Data 2020;7:368.</w:t>
+      </w:r>
+    </w:p>
+    <w:p>
+      <w:pPr>
+        <w:pStyle w:val="BodyText"/>
+      </w:pPr>
+      <w:r>
+        <w:t xml:space="preserve">[27] Trindade A. ElectricityLoadDiagrams20112014 [dataset]. UCI Machine Learning Repository; 2015.</w:t>
+      </w:r>
+    </w:p>
+    <w:p>
+      <w:r>
+        <w:pict>
+          <v:rect style="width:0;height:1.5pt" o:hralign="center" o:hrstd="t" o:hr="t"/>
+        </w:pict>
+      </w:r>
+    </w:p>
+    <w:p>
+      <w:pPr>
+        <w:pStyle w:val="FirstParagraph"/>
+      </w:pPr>
+      <w:r>
+        <w:rPr>
+          <w:i/>
+          <w:iCs/>
+        </w:rPr>
+        <w:t xml:space="preserve">Declarations, acknowledgements, and author information are provided on the separate Title Page.</w:t>
+      </w:r>
+    </w:p>
+    <w:p>
+      <w:r>
+        <w:pict>
+          <v:rect style="width:0;height:1.5pt" o:hralign="center" o:hrstd="t" o:hr="t"/>
+        </w:pict>
       </w:r>
     </w:p>
     <w:bookmarkEnd w:id="35"/>
-    <w:bookmarkStart w:id="36" w:name="credit-author-statement"/>
+    <w:bookmarkStart w:id="41" w:name="appendix-a-multi-seed-results"/>
     <w:p>
       <w:pPr>
         <w:pStyle w:val="Heading2"/>
@@ -3993,390 +4220,19 @@
         <w:tab/>
       </w:r>
       <w:r>
-        <w:t xml:space="preserve">CRediT Author Statement</w:t>
-      </w:r>
-    </w:p>
-    <w:p>
-      <w:pPr>
-        <w:pStyle w:val="FirstParagraph"/>
-      </w:pPr>
-      <w:r>
-        <w:rPr>
-          <w:b/>
-          <w:bCs/>
-        </w:rPr>
-        <w:t xml:space="preserve">Jeong-Uk Kim</w:t>
-      </w:r>
-      <w:r>
-        <w:t xml:space="preserve">: Conceptualization, Methodology, Software, Validation, Formal analysis, Investigation, Data curation, Writing - original draft, Writing - review &amp; editing, Visualization.</w:t>
-      </w:r>
-    </w:p>
-    <w:bookmarkEnd w:id="36"/>
-    <w:bookmarkStart w:id="37" w:name="data-availability"/>
-    <w:p>
-      <w:pPr>
-        <w:pStyle w:val="Heading2"/>
+        <w:t xml:space="preserve">Appendix A: Multi-Seed Results</w:t>
+      </w:r>
+    </w:p>
+    <w:bookmarkStart w:id="36" w:name="a.1-korean-700-revin-on-s-18000-5-seeds"/>
+    <w:p>
+      <w:pPr>
+        <w:pStyle w:val="Heading3"/>
       </w:pPr>
       <w:r>
         <w:rPr>
           <w:rStyle w:val="SectionNumber"/>
         </w:rPr>
-        <w:t xml:space="preserve">1.10</w:t>
-      </w:r>
-      <w:r>
-        <w:tab/>
-      </w:r>
-      <w:r>
-        <w:t xml:space="preserve">Data Availability</w:t>
-      </w:r>
-    </w:p>
-    <w:p>
-      <w:pPr>
-        <w:pStyle w:val="FirstParagraph"/>
-      </w:pPr>
-      <w:r>
-        <w:t xml:space="preserve">The simulation pipeline, model source code, and training configurations are publicly available at https://github.com/jukkim/korean-buildingsbench. The 700-building parametric simulation dataset can be regenerated from the provided pipeline or is available from the corresponding author upon request. Pretrained checkpoints for the primary results (Korean-700 seeds 42–46, BB-700, BB 900K + RevIN, US-TMY-700 seeds 42–46) and n-scaling intermediate points are available from the corresponding author upon request. The BuildingsBench evaluation data can be downloaded from the NREL Open Energy Data Initiative (https://data.openei.org/submissions/5859) under a CC-BY 4.0 license.</w:t>
-      </w:r>
-    </w:p>
-    <w:bookmarkEnd w:id="37"/>
-    <w:bookmarkStart w:id="38" w:name="declaration-of-competing-interest"/>
-    <w:p>
-      <w:pPr>
-        <w:pStyle w:val="Heading2"/>
-      </w:pPr>
-      <w:r>
-        <w:rPr>
-          <w:rStyle w:val="SectionNumber"/>
-        </w:rPr>
-        <w:t xml:space="preserve">1.11</w:t>
-      </w:r>
-      <w:r>
-        <w:tab/>
-      </w:r>
-      <w:r>
-        <w:t xml:space="preserve">Declaration of Competing Interest</w:t>
-      </w:r>
-    </w:p>
-    <w:p>
-      <w:pPr>
-        <w:pStyle w:val="FirstParagraph"/>
-      </w:pPr>
-      <w:r>
-        <w:t xml:space="preserve">The author declares no known competing financial interests or personal relationships that could have appeared to influence the work reported in this paper.</w:t>
-      </w:r>
-    </w:p>
-    <w:p>
-      <w:r>
-        <w:pict>
-          <v:rect style="width:0;height:1.5pt" o:hralign="center" o:hrstd="t" o:hr="t"/>
-        </w:pict>
-      </w:r>
-    </w:p>
-    <w:bookmarkEnd w:id="38"/>
-    <w:bookmarkStart w:id="39" w:name="X1f74eb43af444059c7518034463b6c89b1cacf4"/>
-    <w:p>
-      <w:pPr>
-        <w:pStyle w:val="Heading2"/>
-      </w:pPr>
-      <w:r>
-        <w:rPr>
-          <w:rStyle w:val="SectionNumber"/>
-        </w:rPr>
-        <w:t xml:space="preserve">1.12</w:t>
-      </w:r>
-      <w:r>
-        <w:tab/>
-      </w:r>
-      <w:r>
-        <w:t xml:space="preserve">Declaration of Generative AI and AI-Assisted Technologies in the Manuscript Preparation Process</w:t>
-      </w:r>
-    </w:p>
-    <w:p>
-      <w:pPr>
-        <w:pStyle w:val="FirstParagraph"/>
-      </w:pPr>
-      <w:r>
-        <w:t xml:space="preserve">During the preparation of this work the author used Claude (Anthropic) in order to assist with code development for simulation post-processing, figure generation scripts, and manuscript formatting. After using this tool, the author reviewed and edited the content as needed and takes full responsibility for the content of the published article.</w:t>
-      </w:r>
-    </w:p>
-    <w:p>
-      <w:r>
-        <w:pict>
-          <v:rect style="width:0;height:1.5pt" o:hralign="center" o:hrstd="t" o:hr="t"/>
-        </w:pict>
-      </w:r>
-    </w:p>
-    <w:bookmarkEnd w:id="39"/>
-    <w:bookmarkStart w:id="40" w:name="references"/>
-    <w:p>
-      <w:pPr>
-        <w:pStyle w:val="Heading2"/>
-      </w:pPr>
-      <w:r>
-        <w:rPr>
-          <w:rStyle w:val="SectionNumber"/>
-        </w:rPr>
-        <w:t xml:space="preserve">1.13</w:t>
-      </w:r>
-      <w:r>
-        <w:tab/>
-      </w:r>
-      <w:r>
-        <w:t xml:space="preserve">References</w:t>
-      </w:r>
-    </w:p>
-    <w:p>
-      <w:pPr>
-        <w:pStyle w:val="FirstParagraph"/>
-      </w:pPr>
-      <w:r>
-        <w:t xml:space="preserve">[1] Fan C, et al. A short-term building cooling load prediction method using deep learning algorithms. Appl Energy 2017;195:222–33.</w:t>
-      </w:r>
-    </w:p>
-    <w:p>
-      <w:pPr>
-        <w:pStyle w:val="BodyText"/>
-      </w:pPr>
-      <w:r>
-        <w:t xml:space="preserve">[2] Hong T, et al. Ten questions on urban building energy modeling. Build Environ 2019;168:106508.</w:t>
-      </w:r>
-    </w:p>
-    <w:p>
-      <w:pPr>
-        <w:pStyle w:val="BodyText"/>
-      </w:pPr>
-      <w:r>
-        <w:t xml:space="preserve">[3] Emami P, Sahu A, Graf P. BuildingsBench: A Large-Scale Dataset of 900K Buildings and Benchmark for Short-Term Load Forecasting. Adv Neural Inf Process Syst 2023;36.</w:t>
-      </w:r>
-    </w:p>
-    <w:p>
-      <w:pPr>
-        <w:pStyle w:val="BodyText"/>
-      </w:pPr>
-      <w:r>
-        <w:t xml:space="preserve">[4] Wilson E, et al. End-Use Load Profiles for the U.S. Building Stock. Golden (CO): National Renewable Energy Laboratory; 2022. Report No.: NREL/TP-5500-80889.</w:t>
-      </w:r>
-    </w:p>
-    <w:p>
-      <w:pPr>
-        <w:pStyle w:val="BodyText"/>
-      </w:pPr>
-      <w:r>
-        <w:t xml:space="preserve">[5] Shi J, et al. Scaling Law for Time Series Forecasting. Adv Neural Inf Process Syst 2024;37.</w:t>
-      </w:r>
-    </w:p>
-    <w:p>
-      <w:pPr>
-        <w:pStyle w:val="BodyText"/>
-      </w:pPr>
-      <w:r>
-        <w:t xml:space="preserve">[6] Liu X, et al. MOIRAI-MoE: Empowering Time Series Foundation Models with Sparse Mixture of Experts. Proc Mach Learn Res 2025;267:38940–62.</w:t>
-      </w:r>
-    </w:p>
-    <w:p>
-      <w:pPr>
-        <w:pStyle w:val="BodyText"/>
-      </w:pPr>
-      <w:r>
-        <w:t xml:space="preserve">[7] Zha D, et al. Data-centric AI: Perspectives and Challenges. Proc SIAM Int Conf Data Min; 2023. p. 945–8.</w:t>
-      </w:r>
-    </w:p>
-    <w:p>
-      <w:pPr>
-        <w:pStyle w:val="BodyText"/>
-      </w:pPr>
-      <w:r>
-        <w:t xml:space="preserve">[8] Kim T, et al. Reversible Instance Normalization for Accurate Time-Series Forecasting against Distribution Shift. Int Conf Learn Represent; 2022.</w:t>
-      </w:r>
-    </w:p>
-    <w:p>
-      <w:pPr>
-        <w:pStyle w:val="BodyText"/>
-      </w:pPr>
-      <w:r>
-        <w:t xml:space="preserve">[9] Amasyali K, El-Gohary NM. A review of data-driven building energy consumption prediction studies. Renew Sustain Energy Rev 2018;81:1192–205.</w:t>
-      </w:r>
-    </w:p>
-    <w:p>
-      <w:pPr>
-        <w:pStyle w:val="BodyText"/>
-      </w:pPr>
-      <w:r>
-        <w:t xml:space="preserve">[10] Chen T, Guestrin C. XGBoost: A Scalable Tree Boosting System. Proc 22nd ACM SIGKDD Int Conf Knowl Discov Data Min; 2016. p. 785–94.</w:t>
-      </w:r>
-    </w:p>
-    <w:p>
-      <w:pPr>
-        <w:pStyle w:val="BodyText"/>
-      </w:pPr>
-      <w:r>
-        <w:t xml:space="preserve">[11] Hochreiter S, Schmidhuber J. Long Short-Term Memory. Neural Comput 1997;9(8):1735–80.</w:t>
-      </w:r>
-    </w:p>
-    <w:p>
-      <w:pPr>
-        <w:pStyle w:val="BodyText"/>
-      </w:pPr>
-      <w:r>
-        <w:t xml:space="preserve">[12] Vaswani A, et al. Attention Is All You Need. Adv Neural Inf Process Syst 2017;30.</w:t>
-      </w:r>
-    </w:p>
-    <w:p>
-      <w:pPr>
-        <w:pStyle w:val="BodyText"/>
-      </w:pPr>
-      <w:r>
-        <w:t xml:space="preserve">[13] Nie Y, et al. A Time Series is Worth 64 Words: Long-term Forecasting with Transformers. Int Conf Learn Represent; 2023.</w:t>
-      </w:r>
-    </w:p>
-    <w:p>
-      <w:pPr>
-        <w:pStyle w:val="BodyText"/>
-      </w:pPr>
-      <w:r>
-        <w:t xml:space="preserve">[14] Ribeiro M, et al. Transfer learning with seasonal and trend adjustment for cross-building energy forecasting. Energy Build 2018;165:352–63.</w:t>
-      </w:r>
-    </w:p>
-    <w:p>
-      <w:pPr>
-        <w:pStyle w:val="BodyText"/>
-      </w:pPr>
-      <w:r>
-        <w:t xml:space="preserve">[15] Spencer R, et al. Transfer Learning on Transformers for Building Energy Consumption Forecasting — A Comparative Study. Energy Build 2025;336:115632.</w:t>
-      </w:r>
-    </w:p>
-    <w:p>
-      <w:pPr>
-        <w:pStyle w:val="BodyText"/>
-      </w:pPr>
-      <w:r>
-        <w:t xml:space="preserve">[16] Das A, et al. A decoder-only foundation model for time-series forecasting. Proc Mach Learn Res 2024;235:10148–67.</w:t>
-      </w:r>
-    </w:p>
-    <w:p>
-      <w:pPr>
-        <w:pStyle w:val="BodyText"/>
-      </w:pPr>
-      <w:r>
-        <w:t xml:space="preserve">[17] Ansari AF, et al. Chronos: Learning the Language of Time Series. Trans Mach Learn Res 2024.</w:t>
-      </w:r>
-    </w:p>
-    <w:p>
-      <w:pPr>
-        <w:pStyle w:val="BodyText"/>
-      </w:pPr>
-      <w:r>
-        <w:t xml:space="preserve">[18] Rasul K, et al. Lag-Llama: Towards Foundation Models for Probabilistic Time Series Forecasting. NeurIPS Workshop Robustness Found Models; 2023.</w:t>
-      </w:r>
-    </w:p>
-    <w:p>
-      <w:pPr>
-        <w:pStyle w:val="BodyText"/>
-      </w:pPr>
-      <w:r>
-        <w:t xml:space="preserve">[19] Woo G, et al. Unified Training of Universal Time Series Forecasting Transformers. Proc Mach Learn Res 2024;235:53140–64.</w:t>
-      </w:r>
-    </w:p>
-    <w:p>
-      <w:pPr>
-        <w:pStyle w:val="BodyText"/>
-      </w:pPr>
-      <w:r>
-        <w:t xml:space="preserve">[20] Yao Q, et al. Towards Neural Scaling Laws for Time Series Foundation Models. Int Conf Learn Represent; 2025.</w:t>
-      </w:r>
-    </w:p>
-    <w:p>
-      <w:pPr>
-        <w:pStyle w:val="BodyText"/>
-      </w:pPr>
-      <w:r>
-        <w:t xml:space="preserve">[21] Crawley DB, et al. EnergyPlus: creating a new-generation building energy simulation program. Energy Build 2001;33(4):319–31.</w:t>
-      </w:r>
-    </w:p>
-    <w:p>
-      <w:pPr>
-        <w:pStyle w:val="BodyText"/>
-      </w:pPr>
-      <w:r>
-        <w:t xml:space="preserve">[22] Deru M, et al. U.S. Department of Energy Commercial Reference Building Models of the National Building Stock. Golden (CO): National Renewable Energy Laboratory; 2011. Report No.: NREL/TP-5500-46861.</w:t>
-      </w:r>
-    </w:p>
-    <w:p>
-      <w:pPr>
-        <w:pStyle w:val="BodyText"/>
-      </w:pPr>
-      <w:r>
-        <w:t xml:space="preserve">[23] McKay MD, Beckman RJ, Conover WJ. A Comparison of Three Methods for Selecting Values of Input Variables in the Analysis of Output from a Computer Code. Technometrics 1979;21(2):239–45.</w:t>
-      </w:r>
-    </w:p>
-    <w:p>
-      <w:pPr>
-        <w:pStyle w:val="BodyText"/>
-      </w:pPr>
-      <w:r>
-        <w:t xml:space="preserve">[24] Box GEP, Cox DR. An Analysis of Transformations. J R Stat Soc B 1964;26(2):211–52.</w:t>
-      </w:r>
-    </w:p>
-    <w:p>
-      <w:pPr>
-        <w:pStyle w:val="BodyText"/>
-      </w:pPr>
-      <w:r>
-        <w:t xml:space="preserve">[25] Loshchilov I, Hutter F. Decoupled Weight Decay Regularization. Int Conf Learn Represent; 2019.</w:t>
-      </w:r>
-    </w:p>
-    <w:p>
-      <w:pPr>
-        <w:pStyle w:val="BodyText"/>
-      </w:pPr>
-      <w:r>
-        <w:t xml:space="preserve">[26] Miller C, et al. The Building Data Genome Project 2, energy meter data from the ASHRAE Great Energy Predictor III competition. Sci Data 2020;7:368.</w:t>
-      </w:r>
-    </w:p>
-    <w:p>
-      <w:pPr>
-        <w:pStyle w:val="BodyText"/>
-      </w:pPr>
-      <w:r>
-        <w:t xml:space="preserve">[27] Trindade A. ElectricityLoadDiagrams20112014 [dataset]. UCI Machine Learning Repository; 2015.</w:t>
-      </w:r>
-    </w:p>
-    <w:p>
-      <w:r>
-        <w:pict>
-          <v:rect style="width:0;height:1.5pt" o:hralign="center" o:hrstd="t" o:hr="t"/>
-        </w:pict>
-      </w:r>
-    </w:p>
-    <w:bookmarkEnd w:id="40"/>
-    <w:bookmarkStart w:id="46" w:name="appendix-a-multi-seed-results"/>
-    <w:p>
-      <w:pPr>
-        <w:pStyle w:val="Heading2"/>
-      </w:pPr>
-      <w:r>
-        <w:rPr>
-          <w:rStyle w:val="SectionNumber"/>
-        </w:rPr>
-        <w:t xml:space="preserve">1.14</w:t>
-      </w:r>
-      <w:r>
-        <w:tab/>
-      </w:r>
-      <w:r>
-        <w:t xml:space="preserve">Appendix A: Multi-Seed Results</w:t>
-      </w:r>
-    </w:p>
-    <w:bookmarkStart w:id="41" w:name="a.1-korean-700-revin-on-s-18000-5-seeds"/>
-    <w:p>
-      <w:pPr>
-        <w:pStyle w:val="Heading3"/>
-      </w:pPr>
-      <w:r>
-        <w:rPr>
-          <w:rStyle w:val="SectionNumber"/>
-        </w:rPr>
-        <w:t xml:space="preserve">1.14.1</w:t>
+        <w:t xml:space="preserve">1.9.1</w:t>
       </w:r>
       <w:r>
         <w:tab/>
@@ -4686,8 +4542,8 @@
         <w:t xml:space="preserve">‡ Four-seed mean (seeds 42, 43, 44, 46); seed 45 NCRPS not evaluated with the retrained checkpoint used for NRMSE.</w:t>
       </w:r>
     </w:p>
-    <w:bookmarkEnd w:id="41"/>
-    <w:bookmarkStart w:id="42" w:name="a.2-korean-700-revin-off-s-18000-3-seeds"/>
+    <w:bookmarkEnd w:id="36"/>
+    <w:bookmarkStart w:id="37" w:name="a.2-korean-700-revin-off-s-18000-3-seeds"/>
     <w:p>
       <w:pPr>
         <w:pStyle w:val="Heading3"/>
@@ -4696,7 +4552,7 @@
         <w:rPr>
           <w:rStyle w:val="SectionNumber"/>
         </w:rPr>
-        <w:t xml:space="preserve">1.14.2</w:t>
+        <w:t xml:space="preserve">1.9.2</w:t>
       </w:r>
       <w:r>
         <w:tab/>
@@ -4930,8 +4786,8 @@
         <w:t xml:space="preserve">§ Two-seed mean (seeds 42, 44); seed 43 NCRPS not evaluated.</w:t>
       </w:r>
     </w:p>
-    <w:bookmarkEnd w:id="42"/>
-    <w:bookmarkStart w:id="43" w:name="a.3-korean-700-revin-on-s-16000-5-seeds"/>
+    <w:bookmarkEnd w:id="37"/>
+    <w:bookmarkStart w:id="38" w:name="a.3-korean-700-revin-on-s-16000-5-seeds"/>
     <w:p>
       <w:pPr>
         <w:pStyle w:val="Heading3"/>
@@ -4940,7 +4796,7 @@
         <w:rPr>
           <w:rStyle w:val="SectionNumber"/>
         </w:rPr>
-        <w:t xml:space="preserve">1.14.3</w:t>
+        <w:t xml:space="preserve">1.9.3</w:t>
       </w:r>
       <w:r>
         <w:tab/>
@@ -5161,8 +5017,8 @@
         </w:tc>
       </w:tr>
     </w:tbl>
-    <w:bookmarkEnd w:id="43"/>
-    <w:bookmarkStart w:id="44" w:name="X19de30977b2efbcd7dd418f1d5e794ff568bf73"/>
+    <w:bookmarkEnd w:id="38"/>
+    <w:bookmarkStart w:id="39" w:name="X19de30977b2efbcd7dd418f1d5e794ff568bf73"/>
     <w:p>
       <w:pPr>
         <w:pStyle w:val="Heading3"/>
@@ -5171,7 +5027,7 @@
         <w:rPr>
           <w:rStyle w:val="SectionNumber"/>
         </w:rPr>
-        <w:t xml:space="preserve">1.14.4</w:t>
+        <w:t xml:space="preserve">1.9.4</w:t>
       </w:r>
       <w:r>
         <w:tab/>
@@ -5397,8 +5253,8 @@
         </w:tc>
       </w:tr>
     </w:tbl>
-    <w:bookmarkEnd w:id="44"/>
-    <w:bookmarkStart w:id="45" w:name="a.5-bb-900k-revin"/>
+    <w:bookmarkEnd w:id="39"/>
+    <w:bookmarkStart w:id="40" w:name="a.5-bb-900k-revin"/>
     <w:p>
       <w:pPr>
         <w:pStyle w:val="Heading3"/>
@@ -5407,7 +5263,7 @@
         <w:rPr>
           <w:rStyle w:val="SectionNumber"/>
         </w:rPr>
-        <w:t xml:space="preserve">1.14.5</w:t>
+        <w:t xml:space="preserve">1.9.5</w:t>
       </w:r>
       <w:r>
         <w:tab/>
@@ -5431,9 +5287,9 @@
         </w:pict>
       </w:r>
     </w:p>
-    <w:bookmarkEnd w:id="45"/>
-    <w:bookmarkEnd w:id="46"/>
-    <w:bookmarkStart w:id="47" w:name="appendix-b-bb-700-and-bb-7k-scaling"/>
+    <w:bookmarkEnd w:id="40"/>
+    <w:bookmarkEnd w:id="41"/>
+    <w:bookmarkStart w:id="42" w:name="appendix-b-bb-700-and-bb-7k-scaling"/>
     <w:p>
       <w:pPr>
         <w:pStyle w:val="Heading2"/>
@@ -5442,7 +5298,7 @@
         <w:rPr>
           <w:rStyle w:val="SectionNumber"/>
         </w:rPr>
-        <w:t xml:space="preserve">1.15</w:t>
+        <w:t xml:space="preserve">1.10</w:t>
       </w:r>
       <w:r>
         <w:tab/>
@@ -5922,8 +5778,8 @@
         </w:pict>
       </w:r>
     </w:p>
-    <w:bookmarkEnd w:id="47"/>
-    <w:bookmarkStart w:id="48" w:name="X7705841f826405c94727741dedee731c1f88735"/>
+    <w:bookmarkEnd w:id="42"/>
+    <w:bookmarkStart w:id="43" w:name="X7705841f826405c94727741dedee731c1f88735"/>
     <w:p>
       <w:pPr>
         <w:pStyle w:val="Heading2"/>
@@ -5932,7 +5788,7 @@
         <w:rPr>
           <w:rStyle w:val="SectionNumber"/>
         </w:rPr>
-        <w:t xml:space="preserve">1.16</w:t>
+        <w:t xml:space="preserve">1.11</w:t>
       </w:r>
       <w:r>
         <w:tab/>
@@ -6204,8 +6060,8 @@
         </w:pict>
       </w:r>
     </w:p>
-    <w:bookmarkEnd w:id="48"/>
-    <w:bookmarkStart w:id="49" w:name="figures"/>
+    <w:bookmarkEnd w:id="43"/>
+    <w:bookmarkStart w:id="44" w:name="figures"/>
     <w:p>
       <w:pPr>
         <w:pStyle w:val="Heading2"/>
@@ -6214,7 +6070,7 @@
         <w:rPr>
           <w:rStyle w:val="SectionNumber"/>
         </w:rPr>
-        <w:t xml:space="preserve">1.17</w:t>
+        <w:t xml:space="preserve">1.12</w:t>
       </w:r>
       <w:r>
         <w:tab/>
@@ -6295,8 +6151,8 @@
         <w:t xml:space="preserve">RevIN’s regime-dependent effect across dataset scales. Green arrows: improvement; red: degradation. The asymmetry between small diverse datasets and the full 900K corpus illustrates regime-dependent normalization.</w:t>
       </w:r>
     </w:p>
-    <w:bookmarkEnd w:id="49"/>
-    <w:bookmarkEnd w:id="50"/>
+    <w:bookmarkEnd w:id="44"/>
+    <w:bookmarkEnd w:id="45"/>
     <w:sectPr>
       <w:footnotePr>
         <w:numRestart w:val="eachSect"/>
@@ -7214,7 +7070,7 @@
       <w:color w:themeColor="accent1" w:themeShade="BF" w:val="365F91"/>
     </w:rPr>
   </w:style>
-  <w:style w:customStyle="1" w:styleId="SourceCode" w:type="paragraph">
+  <w:style w:type="paragraph" w:customStyle="1" w:styleId="SourceCode">
     <w:name w:val="Source Code"/>
     <w:basedOn w:val="Normal"/>
     <w:link w:val="VerbatimChar"/>
@@ -7222,7 +7078,7 @@
       <w:wordWrap w:val="off"/>
     </w:pPr>
   </w:style>
-  <w:style w:customStyle="1" w:styleId="KeywordTok" w:type="character">
+  <w:style w:type="character" w:customStyle="1" w:styleId="KeywordTok">
     <w:name w:val="KeywordTok"/>
     <w:basedOn w:val="VerbatimChar"/>
     <w:rPr>
@@ -7230,77 +7086,77 @@
       <w:color w:val="007020"/>
     </w:rPr>
   </w:style>
-  <w:style w:customStyle="1" w:styleId="DataTypeTok" w:type="character">
+  <w:style w:type="character" w:customStyle="1" w:styleId="DataTypeTok">
     <w:name w:val="DataTypeTok"/>
     <w:basedOn w:val="VerbatimChar"/>
     <w:rPr>
       <w:color w:val="902000"/>
     </w:rPr>
   </w:style>
-  <w:style w:customStyle="1" w:styleId="DecValTok" w:type="character">
+  <w:style w:type="character" w:customStyle="1" w:styleId="DecValTok">
     <w:name w:val="DecValTok"/>
     <w:basedOn w:val="VerbatimChar"/>
     <w:rPr>
       <w:color w:val="40a070"/>
     </w:rPr>
   </w:style>
-  <w:style w:customStyle="1" w:styleId="BaseNTok" w:type="character">
+  <w:style w:type="character" w:customStyle="1" w:styleId="BaseNTok">
     <w:name w:val="BaseNTok"/>
     <w:basedOn w:val="VerbatimChar"/>
     <w:rPr>
       <w:color w:val="40a070"/>
     </w:rPr>
   </w:style>
-  <w:style w:customStyle="1" w:styleId="FloatTok" w:type="character">
+  <w:style w:type="character" w:customStyle="1" w:styleId="FloatTok">
     <w:name w:val="FloatTok"/>
     <w:basedOn w:val="VerbatimChar"/>
     <w:rPr>
       <w:color w:val="40a070"/>
     </w:rPr>
   </w:style>
-  <w:style w:customStyle="1" w:styleId="ConstantTok" w:type="character">
+  <w:style w:type="character" w:customStyle="1" w:styleId="ConstantTok">
     <w:name w:val="ConstantTok"/>
     <w:basedOn w:val="VerbatimChar"/>
     <w:rPr>
       <w:color w:val="880000"/>
     </w:rPr>
   </w:style>
-  <w:style w:customStyle="1" w:styleId="CharTok" w:type="character">
+  <w:style w:type="character" w:customStyle="1" w:styleId="CharTok">
     <w:name w:val="CharTok"/>
     <w:basedOn w:val="VerbatimChar"/>
     <w:rPr>
       <w:color w:val="4070a0"/>
     </w:rPr>
   </w:style>
-  <w:style w:customStyle="1" w:styleId="SpecialCharTok" w:type="character">
+  <w:style w:type="character" w:customStyle="1" w:styleId="SpecialCharTok">
     <w:name w:val="SpecialCharTok"/>
     <w:basedOn w:val="VerbatimChar"/>
     <w:rPr>
       <w:color w:val="4070a0"/>
     </w:rPr>
   </w:style>
-  <w:style w:customStyle="1" w:styleId="StringTok" w:type="character">
+  <w:style w:type="character" w:customStyle="1" w:styleId="StringTok">
     <w:name w:val="StringTok"/>
     <w:basedOn w:val="VerbatimChar"/>
     <w:rPr>
       <w:color w:val="4070a0"/>
     </w:rPr>
   </w:style>
-  <w:style w:customStyle="1" w:styleId="VerbatimStringTok" w:type="character">
+  <w:style w:type="character" w:customStyle="1" w:styleId="VerbatimStringTok">
     <w:name w:val="VerbatimStringTok"/>
     <w:basedOn w:val="VerbatimChar"/>
     <w:rPr>
       <w:color w:val="4070a0"/>
     </w:rPr>
   </w:style>
-  <w:style w:customStyle="1" w:styleId="SpecialStringTok" w:type="character">
+  <w:style w:type="character" w:customStyle="1" w:styleId="SpecialStringTok">
     <w:name w:val="SpecialStringTok"/>
     <w:basedOn w:val="VerbatimChar"/>
     <w:rPr>
       <w:color w:val="bb6688"/>
     </w:rPr>
   </w:style>
-  <w:style w:customStyle="1" w:styleId="ImportTok" w:type="character">
+  <w:style w:type="character" w:customStyle="1" w:styleId="ImportTok">
     <w:name w:val="ImportTok"/>
     <w:basedOn w:val="VerbatimChar"/>
     <w:rPr>
@@ -7308,7 +7164,7 @@
       <w:color w:val="008000"/>
     </w:rPr>
   </w:style>
-  <w:style w:customStyle="1" w:styleId="CommentTok" w:type="character">
+  <w:style w:type="character" w:customStyle="1" w:styleId="CommentTok">
     <w:name w:val="CommentTok"/>
     <w:basedOn w:val="VerbatimChar"/>
     <w:rPr>
@@ -7316,7 +7172,7 @@
       <w:color w:val="60a0b0"/>
     </w:rPr>
   </w:style>
-  <w:style w:customStyle="1" w:styleId="DocumentationTok" w:type="character">
+  <w:style w:type="character" w:customStyle="1" w:styleId="DocumentationTok">
     <w:name w:val="DocumentationTok"/>
     <w:basedOn w:val="VerbatimChar"/>
     <w:rPr>
@@ -7324,7 +7180,7 @@
       <w:color w:val="ba2121"/>
     </w:rPr>
   </w:style>
-  <w:style w:customStyle="1" w:styleId="AnnotationTok" w:type="character">
+  <w:style w:type="character" w:customStyle="1" w:styleId="AnnotationTok">
     <w:name w:val="AnnotationTok"/>
     <w:basedOn w:val="VerbatimChar"/>
     <w:rPr>
@@ -7333,7 +7189,7 @@
       <w:color w:val="60a0b0"/>
     </w:rPr>
   </w:style>
-  <w:style w:customStyle="1" w:styleId="CommentVarTok" w:type="character">
+  <w:style w:type="character" w:customStyle="1" w:styleId="CommentVarTok">
     <w:name w:val="CommentVarTok"/>
     <w:basedOn w:val="VerbatimChar"/>
     <w:rPr>
@@ -7342,28 +7198,28 @@
       <w:color w:val="60a0b0"/>
     </w:rPr>
   </w:style>
-  <w:style w:customStyle="1" w:styleId="OtherTok" w:type="character">
+  <w:style w:type="character" w:customStyle="1" w:styleId="OtherTok">
     <w:name w:val="OtherTok"/>
     <w:basedOn w:val="VerbatimChar"/>
     <w:rPr>
       <w:color w:val="007020"/>
     </w:rPr>
   </w:style>
-  <w:style w:customStyle="1" w:styleId="FunctionTok" w:type="character">
+  <w:style w:type="character" w:customStyle="1" w:styleId="FunctionTok">
     <w:name w:val="FunctionTok"/>
     <w:basedOn w:val="VerbatimChar"/>
     <w:rPr>
       <w:color w:val="06287e"/>
     </w:rPr>
   </w:style>
-  <w:style w:customStyle="1" w:styleId="VariableTok" w:type="character">
+  <w:style w:type="character" w:customStyle="1" w:styleId="VariableTok">
     <w:name w:val="VariableTok"/>
     <w:basedOn w:val="VerbatimChar"/>
     <w:rPr>
       <w:color w:val="19177c"/>
     </w:rPr>
   </w:style>
-  <w:style w:customStyle="1" w:styleId="ControlFlowTok" w:type="character">
+  <w:style w:type="character" w:customStyle="1" w:styleId="ControlFlowTok">
     <w:name w:val="ControlFlowTok"/>
     <w:basedOn w:val="VerbatimChar"/>
     <w:rPr>
@@ -7371,45 +7227,45 @@
       <w:color w:val="007020"/>
     </w:rPr>
   </w:style>
-  <w:style w:customStyle="1" w:styleId="OperatorTok" w:type="character">
+  <w:style w:type="character" w:customStyle="1" w:styleId="OperatorTok">
     <w:name w:val="OperatorTok"/>
     <w:basedOn w:val="VerbatimChar"/>
     <w:rPr>
       <w:color w:val="666666"/>
     </w:rPr>
   </w:style>
-  <w:style w:customStyle="1" w:styleId="BuiltInTok" w:type="character">
+  <w:style w:type="character" w:customStyle="1" w:styleId="BuiltInTok">
     <w:name w:val="BuiltInTok"/>
     <w:basedOn w:val="VerbatimChar"/>
     <w:rPr>
       <w:color w:val="008000"/>
     </w:rPr>
   </w:style>
-  <w:style w:customStyle="1" w:styleId="ExtensionTok" w:type="character">
+  <w:style w:type="character" w:customStyle="1" w:styleId="ExtensionTok">
     <w:name w:val="ExtensionTok"/>
     <w:basedOn w:val="VerbatimChar"/>
     <w:rPr/>
   </w:style>
-  <w:style w:customStyle="1" w:styleId="PreprocessorTok" w:type="character">
+  <w:style w:type="character" w:customStyle="1" w:styleId="PreprocessorTok">
     <w:name w:val="PreprocessorTok"/>
     <w:basedOn w:val="VerbatimChar"/>
     <w:rPr>
       <w:color w:val="bc7a00"/>
     </w:rPr>
   </w:style>
-  <w:style w:customStyle="1" w:styleId="AttributeTok" w:type="character">
+  <w:style w:type="character" w:customStyle="1" w:styleId="AttributeTok">
     <w:name w:val="AttributeTok"/>
     <w:basedOn w:val="VerbatimChar"/>
     <w:rPr>
       <w:color w:val="7d9029"/>
     </w:rPr>
   </w:style>
-  <w:style w:customStyle="1" w:styleId="RegionMarkerTok" w:type="character">
+  <w:style w:type="character" w:customStyle="1" w:styleId="RegionMarkerTok">
     <w:name w:val="RegionMarkerTok"/>
     <w:basedOn w:val="VerbatimChar"/>
     <w:rPr/>
   </w:style>
-  <w:style w:customStyle="1" w:styleId="InformationTok" w:type="character">
+  <w:style w:type="character" w:customStyle="1" w:styleId="InformationTok">
     <w:name w:val="InformationTok"/>
     <w:basedOn w:val="VerbatimChar"/>
     <w:rPr>
@@ -7418,7 +7274,7 @@
       <w:color w:val="60a0b0"/>
     </w:rPr>
   </w:style>
-  <w:style w:customStyle="1" w:styleId="WarningTok" w:type="character">
+  <w:style w:type="character" w:customStyle="1" w:styleId="WarningTok">
     <w:name w:val="WarningTok"/>
     <w:basedOn w:val="VerbatimChar"/>
     <w:rPr>
@@ -7427,7 +7283,7 @@
       <w:color w:val="60a0b0"/>
     </w:rPr>
   </w:style>
-  <w:style w:customStyle="1" w:styleId="AlertTok" w:type="character">
+  <w:style w:type="character" w:customStyle="1" w:styleId="AlertTok">
     <w:name w:val="AlertTok"/>
     <w:basedOn w:val="VerbatimChar"/>
     <w:rPr>
@@ -7435,7 +7291,7 @@
       <w:color w:val="ff0000"/>
     </w:rPr>
   </w:style>
-  <w:style w:customStyle="1" w:styleId="ErrorTok" w:type="character">
+  <w:style w:type="character" w:customStyle="1" w:styleId="ErrorTok">
     <w:name w:val="ErrorTok"/>
     <w:basedOn w:val="VerbatimChar"/>
     <w:rPr>
@@ -7443,7 +7299,7 @@
       <w:color w:val="ff0000"/>
     </w:rPr>
   </w:style>
-  <w:style w:customStyle="1" w:styleId="NormalTok" w:type="character">
+  <w:style w:type="character" w:customStyle="1" w:styleId="NormalTok">
     <w:name w:val="NormalTok"/>
     <w:basedOn w:val="VerbatimChar"/>
     <w:rPr/>

</xml_diff>